<commit_message>
Nhóm B (1.0.6, chưa phát hành): báo cáo Word tỉnh có diễn biến theo tháng (bảng, biểu đồ, so với tháng trước); báo cáo Word cấp xã có bảng theo đợt; nhắc xã chậm trong dự án liên xã; VM-16, VM-28 người dùng tự điền (QD-34)
Co-Authored-By: Claude Opus 5.5 <noreply@anthropic.com>
Claude-Session: https://claude.ai/code/session_01BZcswa4gE3voAhFCMjfJc5
</commit_message>
<xml_diff>
--- a/apps/desktop/public/mau-van-ban/bao-cao-tong-hop-tinh.docx
+++ b/apps/desktop/public/mau-van-ban/bao-cao-tong-hop-tinh.docx
@@ -1721,6 +1721,577 @@
           <w:szCs w:val="22"/>
         </w:rPr>
         <w:t xml:space="preserve">(Giá trị tạm tính là tổng các khoản phần mềm tính theo hồ sơ, chưa phải số đã phê duyệt; chi tiết: Phụ lục Excel kèm theo)</w:t>
+      </w:r>
+    </w:p>
+    <w:p>
+      <w:pPr>
+        <w:spacing w:after="80" w:before="0" w:line="300"/>
+        <w:ind w:firstLine="567"/>
+        <w:jc w:val="both"/>
+      </w:pPr>
+      <w:r>
+        <w:rPr>
+          <w:rFonts w:ascii="Times New Roman" w:cs="Times New Roman" w:eastAsia="Times New Roman" w:hAnsi="Times New Roman"/>
+          <w:sz w:val="26"/>
+          <w:szCs w:val="26"/>
+        </w:rPr>
+        <w:t xml:space="preserve">{#co_dien_bien}</w:t>
+      </w:r>
+    </w:p>
+    <w:p>
+      <w:pPr>
+        <w:spacing w:after="80" w:before="120" w:line="300"/>
+        <w:ind w:firstLine="567"/>
+        <w:jc w:val="both"/>
+      </w:pPr>
+      <w:r>
+        <w:rPr>
+          <w:rFonts w:ascii="Times New Roman" w:cs="Times New Roman" w:eastAsia="Times New Roman" w:hAnsi="Times New Roman"/>
+          <w:b/>
+          <w:bCs/>
+          <w:i/>
+          <w:iCs/>
+          <w:sz w:val="26"/>
+          <w:szCs w:val="26"/>
+        </w:rPr>
+        <w:t xml:space="preserve">4. Diễn biến theo tháng</w:t>
+      </w:r>
+    </w:p>
+    <w:p>
+      <w:pPr>
+        <w:spacing w:after="80" w:before="0" w:line="300"/>
+        <w:ind w:firstLine="567"/>
+        <w:jc w:val="both"/>
+      </w:pPr>
+      <w:r>
+        <w:rPr>
+          <w:rFonts w:ascii="Times New Roman" w:cs="Times New Roman" w:eastAsia="Times New Roman" w:hAnsi="Times New Roman"/>
+          <w:sz w:val="26"/>
+          <w:szCs w:val="26"/>
+        </w:rPr>
+        <w:t xml:space="preserve">{cau_dien_bien}</w:t>
+      </w:r>
+    </w:p>
+    <w:tbl>
+      <w:tblPr>
+        <w:tblW w:type="dxa" w:w="9071"/>
+        <w:tblBorders>
+          <w:top w:val="single" w:color="auto" w:sz="4"/>
+          <w:left w:val="single" w:color="auto" w:sz="4"/>
+          <w:bottom w:val="single" w:color="auto" w:sz="4"/>
+          <w:right w:val="single" w:color="auto" w:sz="4"/>
+          <w:insideH w:val="single" w:color="auto" w:sz="4"/>
+          <w:insideV w:val="single" w:color="auto" w:sz="4"/>
+        </w:tblBorders>
+      </w:tblPr>
+      <w:tblGrid>
+        <w:gridCol w:w="500"/>
+        <w:gridCol w:w="1171"/>
+        <w:gridCol w:w="1000"/>
+        <w:gridCol w:w="900"/>
+        <w:gridCol w:w="1700"/>
+        <w:gridCol w:w="1700"/>
+        <w:gridCol w:w="2100"/>
+      </w:tblGrid>
+      <w:tr>
+        <w:trPr>
+          <w:tblHeader/>
+        </w:trPr>
+        <w:tc>
+          <w:tcPr>
+            <w:tcW w:type="dxa" w:w="500"/>
+            <w:tcBorders>
+              <w:top w:val="single" w:color="000000" w:sz="4"/>
+              <w:left w:val="single" w:color="000000" w:sz="4"/>
+              <w:bottom w:val="single" w:color="000000" w:sz="4"/>
+              <w:right w:val="single" w:color="000000" w:sz="4"/>
+            </w:tcBorders>
+            <w:tcMar>
+              <w:top w:type="dxa" w:w="40"/>
+              <w:left w:type="dxa" w:w="60"/>
+              <w:bottom w:type="dxa" w:w="40"/>
+              <w:right w:type="dxa" w:w="60"/>
+            </w:tcMar>
+            <w:vAlign w:val="center"/>
+          </w:tcPr>
+          <w:p>
+            <w:pPr>
+              <w:jc w:val="center"/>
+            </w:pPr>
+            <w:r>
+              <w:rPr>
+                <w:rFonts w:ascii="Times New Roman" w:cs="Times New Roman" w:eastAsia="Times New Roman" w:hAnsi="Times New Roman"/>
+                <w:b/>
+                <w:bCs/>
+                <w:sz w:val="22"/>
+                <w:szCs w:val="22"/>
+              </w:rPr>
+              <w:t xml:space="preserve">TT</w:t>
+            </w:r>
+          </w:p>
+        </w:tc>
+        <w:tc>
+          <w:tcPr>
+            <w:tcW w:type="dxa" w:w="1171"/>
+            <w:tcBorders>
+              <w:top w:val="single" w:color="000000" w:sz="4"/>
+              <w:left w:val="single" w:color="000000" w:sz="4"/>
+              <w:bottom w:val="single" w:color="000000" w:sz="4"/>
+              <w:right w:val="single" w:color="000000" w:sz="4"/>
+            </w:tcBorders>
+            <w:tcMar>
+              <w:top w:type="dxa" w:w="40"/>
+              <w:left w:type="dxa" w:w="60"/>
+              <w:bottom w:type="dxa" w:w="40"/>
+              <w:right w:type="dxa" w:w="60"/>
+            </w:tcMar>
+            <w:vAlign w:val="center"/>
+          </w:tcPr>
+          <w:p>
+            <w:pPr>
+              <w:jc w:val="left"/>
+            </w:pPr>
+            <w:r>
+              <w:rPr>
+                <w:rFonts w:ascii="Times New Roman" w:cs="Times New Roman" w:eastAsia="Times New Roman" w:hAnsi="Times New Roman"/>
+                <w:b/>
+                <w:bCs/>
+                <w:sz w:val="22"/>
+                <w:szCs w:val="22"/>
+              </w:rPr>
+              <w:t xml:space="preserve">Tháng</w:t>
+            </w:r>
+          </w:p>
+        </w:tc>
+        <w:tc>
+          <w:tcPr>
+            <w:tcW w:type="dxa" w:w="1000"/>
+            <w:tcBorders>
+              <w:top w:val="single" w:color="000000" w:sz="4"/>
+              <w:left w:val="single" w:color="000000" w:sz="4"/>
+              <w:bottom w:val="single" w:color="000000" w:sz="4"/>
+              <w:right w:val="single" w:color="000000" w:sz="4"/>
+            </w:tcBorders>
+            <w:tcMar>
+              <w:top w:type="dxa" w:w="40"/>
+              <w:left w:type="dxa" w:w="60"/>
+              <w:bottom w:type="dxa" w:w="40"/>
+              <w:right w:type="dxa" w:w="60"/>
+            </w:tcMar>
+            <w:vAlign w:val="center"/>
+          </w:tcPr>
+          <w:p>
+            <w:pPr>
+              <w:jc w:val="center"/>
+            </w:pPr>
+            <w:r>
+              <w:rPr>
+                <w:rFonts w:ascii="Times New Roman" w:cs="Times New Roman" w:eastAsia="Times New Roman" w:hAnsi="Times New Roman"/>
+                <w:b/>
+                <w:bCs/>
+                <w:sz w:val="22"/>
+                <w:szCs w:val="22"/>
+              </w:rPr>
+              <w:t xml:space="preserve">Đơn vị có số liệu</w:t>
+            </w:r>
+          </w:p>
+        </w:tc>
+        <w:tc>
+          <w:tcPr>
+            <w:tcW w:type="dxa" w:w="900"/>
+            <w:tcBorders>
+              <w:top w:val="single" w:color="000000" w:sz="4"/>
+              <w:left w:val="single" w:color="000000" w:sz="4"/>
+              <w:bottom w:val="single" w:color="000000" w:sz="4"/>
+              <w:right w:val="single" w:color="000000" w:sz="4"/>
+            </w:tcBorders>
+            <w:tcMar>
+              <w:top w:type="dxa" w:w="40"/>
+              <w:left w:type="dxa" w:w="60"/>
+              <w:bottom w:type="dxa" w:w="40"/>
+              <w:right w:type="dxa" w:w="60"/>
+            </w:tcMar>
+            <w:vAlign w:val="center"/>
+          </w:tcPr>
+          <w:p>
+            <w:pPr>
+              <w:jc w:val="center"/>
+            </w:pPr>
+            <w:r>
+              <w:rPr>
+                <w:rFonts w:ascii="Times New Roman" w:cs="Times New Roman" w:eastAsia="Times New Roman" w:hAnsi="Times New Roman"/>
+                <w:b/>
+                <w:bCs/>
+                <w:sz w:val="22"/>
+                <w:szCs w:val="22"/>
+              </w:rPr>
+              <w:t xml:space="preserve">Số hộ</w:t>
+            </w:r>
+          </w:p>
+        </w:tc>
+        <w:tc>
+          <w:tcPr>
+            <w:tcW w:type="dxa" w:w="1700"/>
+            <w:tcBorders>
+              <w:top w:val="single" w:color="000000" w:sz="4"/>
+              <w:left w:val="single" w:color="000000" w:sz="4"/>
+              <w:bottom w:val="single" w:color="000000" w:sz="4"/>
+              <w:right w:val="single" w:color="000000" w:sz="4"/>
+            </w:tcBorders>
+            <w:tcMar>
+              <w:top w:type="dxa" w:w="40"/>
+              <w:left w:type="dxa" w:w="60"/>
+              <w:bottom w:type="dxa" w:w="40"/>
+              <w:right w:type="dxa" w:w="60"/>
+            </w:tcMar>
+            <w:vAlign w:val="center"/>
+          </w:tcPr>
+          <w:p>
+            <w:pPr>
+              <w:jc w:val="center"/>
+            </w:pPr>
+            <w:r>
+              <w:rPr>
+                <w:rFonts w:ascii="Times New Roman" w:cs="Times New Roman" w:eastAsia="Times New Roman" w:hAnsi="Times New Roman"/>
+                <w:b/>
+                <w:bCs/>
+                <w:sz w:val="22"/>
+                <w:szCs w:val="22"/>
+              </w:rPr>
+              <w:t xml:space="preserve">Đã bàn giao MB (hộ, %)</w:t>
+            </w:r>
+          </w:p>
+        </w:tc>
+        <w:tc>
+          <w:tcPr>
+            <w:tcW w:type="dxa" w:w="1700"/>
+            <w:tcBorders>
+              <w:top w:val="single" w:color="000000" w:sz="4"/>
+              <w:left w:val="single" w:color="000000" w:sz="4"/>
+              <w:bottom w:val="single" w:color="000000" w:sz="4"/>
+              <w:right w:val="single" w:color="000000" w:sz="4"/>
+            </w:tcBorders>
+            <w:tcMar>
+              <w:top w:type="dxa" w:w="40"/>
+              <w:left w:type="dxa" w:w="60"/>
+              <w:bottom w:type="dxa" w:w="40"/>
+              <w:right w:type="dxa" w:w="60"/>
+            </w:tcMar>
+            <w:vAlign w:val="center"/>
+          </w:tcPr>
+          <w:p>
+            <w:pPr>
+              <w:jc w:val="center"/>
+            </w:pPr>
+            <w:r>
+              <w:rPr>
+                <w:rFonts w:ascii="Times New Roman" w:cs="Times New Roman" w:eastAsia="Times New Roman" w:hAnsi="Times New Roman"/>
+                <w:b/>
+                <w:bCs/>
+                <w:sz w:val="22"/>
+                <w:szCs w:val="22"/>
+              </w:rPr>
+              <w:t xml:space="preserve">Đã duyệt PA (hộ, %)</w:t>
+            </w:r>
+          </w:p>
+        </w:tc>
+        <w:tc>
+          <w:tcPr>
+            <w:tcW w:type="dxa" w:w="2100"/>
+            <w:tcBorders>
+              <w:top w:val="single" w:color="000000" w:sz="4"/>
+              <w:left w:val="single" w:color="000000" w:sz="4"/>
+              <w:bottom w:val="single" w:color="000000" w:sz="4"/>
+              <w:right w:val="single" w:color="000000" w:sz="4"/>
+            </w:tcBorders>
+            <w:tcMar>
+              <w:top w:type="dxa" w:w="40"/>
+              <w:left w:type="dxa" w:w="60"/>
+              <w:bottom w:type="dxa" w:w="40"/>
+              <w:right w:type="dxa" w:w="60"/>
+            </w:tcMar>
+            <w:vAlign w:val="center"/>
+          </w:tcPr>
+          <w:p>
+            <w:pPr>
+              <w:jc w:val="center"/>
+            </w:pPr>
+            <w:r>
+              <w:rPr>
+                <w:rFonts w:ascii="Times New Roman" w:cs="Times New Roman" w:eastAsia="Times New Roman" w:hAnsi="Times New Roman"/>
+                <w:b/>
+                <w:bCs/>
+                <w:sz w:val="22"/>
+                <w:szCs w:val="22"/>
+              </w:rPr>
+              <w:t xml:space="preserve">Giá trị tạm tính (đồng)</w:t>
+            </w:r>
+          </w:p>
+        </w:tc>
+      </w:tr>
+      <w:tr>
+        <w:tc>
+          <w:tcPr>
+            <w:tcW w:type="dxa" w:w="500"/>
+            <w:tcBorders>
+              <w:top w:val="single" w:color="000000" w:sz="4"/>
+              <w:left w:val="single" w:color="000000" w:sz="4"/>
+              <w:bottom w:val="single" w:color="000000" w:sz="4"/>
+              <w:right w:val="single" w:color="000000" w:sz="4"/>
+            </w:tcBorders>
+            <w:tcMar>
+              <w:top w:type="dxa" w:w="40"/>
+              <w:left w:type="dxa" w:w="60"/>
+              <w:bottom w:type="dxa" w:w="40"/>
+              <w:right w:type="dxa" w:w="60"/>
+            </w:tcMar>
+            <w:vAlign w:val="center"/>
+          </w:tcPr>
+          <w:p>
+            <w:pPr>
+              <w:jc w:val="center"/>
+            </w:pPr>
+            <w:r>
+              <w:rPr>
+                <w:rFonts w:ascii="Times New Roman" w:cs="Times New Roman" w:eastAsia="Times New Roman" w:hAnsi="Times New Roman"/>
+                <w:sz w:val="22"/>
+                <w:szCs w:val="22"/>
+              </w:rPr>
+              <w:t xml:space="preserve">{#dien_bien}{tt}</w:t>
+            </w:r>
+          </w:p>
+        </w:tc>
+        <w:tc>
+          <w:tcPr>
+            <w:tcW w:type="dxa" w:w="1171"/>
+            <w:tcBorders>
+              <w:top w:val="single" w:color="000000" w:sz="4"/>
+              <w:left w:val="single" w:color="000000" w:sz="4"/>
+              <w:bottom w:val="single" w:color="000000" w:sz="4"/>
+              <w:right w:val="single" w:color="000000" w:sz="4"/>
+            </w:tcBorders>
+            <w:tcMar>
+              <w:top w:type="dxa" w:w="40"/>
+              <w:left w:type="dxa" w:w="60"/>
+              <w:bottom w:type="dxa" w:w="40"/>
+              <w:right w:type="dxa" w:w="60"/>
+            </w:tcMar>
+            <w:vAlign w:val="center"/>
+          </w:tcPr>
+          <w:p>
+            <w:pPr>
+              <w:jc w:val="left"/>
+            </w:pPr>
+            <w:r>
+              <w:rPr>
+                <w:rFonts w:ascii="Times New Roman" w:cs="Times New Roman" w:eastAsia="Times New Roman" w:hAnsi="Times New Roman"/>
+                <w:sz w:val="22"/>
+                <w:szCs w:val="22"/>
+              </w:rPr>
+              <w:t xml:space="preserve">{thang}</w:t>
+            </w:r>
+          </w:p>
+        </w:tc>
+        <w:tc>
+          <w:tcPr>
+            <w:tcW w:type="dxa" w:w="1000"/>
+            <w:tcBorders>
+              <w:top w:val="single" w:color="000000" w:sz="4"/>
+              <w:left w:val="single" w:color="000000" w:sz="4"/>
+              <w:bottom w:val="single" w:color="000000" w:sz="4"/>
+              <w:right w:val="single" w:color="000000" w:sz="4"/>
+            </w:tcBorders>
+            <w:tcMar>
+              <w:top w:type="dxa" w:w="40"/>
+              <w:left w:type="dxa" w:w="60"/>
+              <w:bottom w:type="dxa" w:w="40"/>
+              <w:right w:type="dxa" w:w="60"/>
+            </w:tcMar>
+            <w:vAlign w:val="center"/>
+          </w:tcPr>
+          <w:p>
+            <w:pPr>
+              <w:jc w:val="right"/>
+            </w:pPr>
+            <w:r>
+              <w:rPr>
+                <w:rFonts w:ascii="Times New Roman" w:cs="Times New Roman" w:eastAsia="Times New Roman" w:hAnsi="Times New Roman"/>
+                <w:sz w:val="22"/>
+                <w:szCs w:val="22"/>
+              </w:rPr>
+              <w:t xml:space="preserve">{don_vi}</w:t>
+            </w:r>
+          </w:p>
+        </w:tc>
+        <w:tc>
+          <w:tcPr>
+            <w:tcW w:type="dxa" w:w="900"/>
+            <w:tcBorders>
+              <w:top w:val="single" w:color="000000" w:sz="4"/>
+              <w:left w:val="single" w:color="000000" w:sz="4"/>
+              <w:bottom w:val="single" w:color="000000" w:sz="4"/>
+              <w:right w:val="single" w:color="000000" w:sz="4"/>
+            </w:tcBorders>
+            <w:tcMar>
+              <w:top w:type="dxa" w:w="40"/>
+              <w:left w:type="dxa" w:w="60"/>
+              <w:bottom w:type="dxa" w:w="40"/>
+              <w:right w:type="dxa" w:w="60"/>
+            </w:tcMar>
+            <w:vAlign w:val="center"/>
+          </w:tcPr>
+          <w:p>
+            <w:pPr>
+              <w:jc w:val="right"/>
+            </w:pPr>
+            <w:r>
+              <w:rPr>
+                <w:rFonts w:ascii="Times New Roman" w:cs="Times New Roman" w:eastAsia="Times New Roman" w:hAnsi="Times New Roman"/>
+                <w:sz w:val="22"/>
+                <w:szCs w:val="22"/>
+              </w:rPr>
+              <w:t xml:space="preserve">{so_ho}</w:t>
+            </w:r>
+          </w:p>
+        </w:tc>
+        <w:tc>
+          <w:tcPr>
+            <w:tcW w:type="dxa" w:w="1700"/>
+            <w:tcBorders>
+              <w:top w:val="single" w:color="000000" w:sz="4"/>
+              <w:left w:val="single" w:color="000000" w:sz="4"/>
+              <w:bottom w:val="single" w:color="000000" w:sz="4"/>
+              <w:right w:val="single" w:color="000000" w:sz="4"/>
+            </w:tcBorders>
+            <w:tcMar>
+              <w:top w:type="dxa" w:w="40"/>
+              <w:left w:type="dxa" w:w="60"/>
+              <w:bottom w:type="dxa" w:w="40"/>
+              <w:right w:type="dxa" w:w="60"/>
+            </w:tcMar>
+            <w:vAlign w:val="center"/>
+          </w:tcPr>
+          <w:p>
+            <w:pPr>
+              <w:jc w:val="right"/>
+            </w:pPr>
+            <w:r>
+              <w:rPr>
+                <w:rFonts w:ascii="Times New Roman" w:cs="Times New Roman" w:eastAsia="Times New Roman" w:hAnsi="Times New Roman"/>
+                <w:sz w:val="22"/>
+                <w:szCs w:val="22"/>
+              </w:rPr>
+              <w:t xml:space="preserve">{ban_giao}</w:t>
+            </w:r>
+          </w:p>
+        </w:tc>
+        <w:tc>
+          <w:tcPr>
+            <w:tcW w:type="dxa" w:w="1700"/>
+            <w:tcBorders>
+              <w:top w:val="single" w:color="000000" w:sz="4"/>
+              <w:left w:val="single" w:color="000000" w:sz="4"/>
+              <w:bottom w:val="single" w:color="000000" w:sz="4"/>
+              <w:right w:val="single" w:color="000000" w:sz="4"/>
+            </w:tcBorders>
+            <w:tcMar>
+              <w:top w:type="dxa" w:w="40"/>
+              <w:left w:type="dxa" w:w="60"/>
+              <w:bottom w:type="dxa" w:w="40"/>
+              <w:right w:type="dxa" w:w="60"/>
+            </w:tcMar>
+            <w:vAlign w:val="center"/>
+          </w:tcPr>
+          <w:p>
+            <w:pPr>
+              <w:jc w:val="right"/>
+            </w:pPr>
+            <w:r>
+              <w:rPr>
+                <w:rFonts w:ascii="Times New Roman" w:cs="Times New Roman" w:eastAsia="Times New Roman" w:hAnsi="Times New Roman"/>
+                <w:sz w:val="22"/>
+                <w:szCs w:val="22"/>
+              </w:rPr>
+              <w:t xml:space="preserve">{duyet_pa}</w:t>
+            </w:r>
+          </w:p>
+        </w:tc>
+        <w:tc>
+          <w:tcPr>
+            <w:tcW w:type="dxa" w:w="2100"/>
+            <w:tcBorders>
+              <w:top w:val="single" w:color="000000" w:sz="4"/>
+              <w:left w:val="single" w:color="000000" w:sz="4"/>
+              <w:bottom w:val="single" w:color="000000" w:sz="4"/>
+              <w:right w:val="single" w:color="000000" w:sz="4"/>
+            </w:tcBorders>
+            <w:tcMar>
+              <w:top w:type="dxa" w:w="40"/>
+              <w:left w:type="dxa" w:w="60"/>
+              <w:bottom w:type="dxa" w:w="40"/>
+              <w:right w:type="dxa" w:w="60"/>
+            </w:tcMar>
+            <w:vAlign w:val="center"/>
+          </w:tcPr>
+          <w:p>
+            <w:pPr>
+              <w:jc w:val="right"/>
+            </w:pPr>
+            <w:r>
+              <w:rPr>
+                <w:rFonts w:ascii="Times New Roman" w:cs="Times New Roman" w:eastAsia="Times New Roman" w:hAnsi="Times New Roman"/>
+                <w:sz w:val="22"/>
+                <w:szCs w:val="22"/>
+              </w:rPr>
+              <w:t xml:space="preserve">{tam_tinh}{/dien_bien}</w:t>
+            </w:r>
+          </w:p>
+        </w:tc>
+      </w:tr>
+    </w:tbl>
+    <w:p>
+      <w:pPr>
+        <w:spacing w:after="80" w:before="60" w:line="300"/>
+        <w:jc w:val="center"/>
+      </w:pPr>
+      <w:r>
+        <w:rPr>
+          <w:rFonts w:ascii="Times New Roman" w:cs="Times New Roman" w:eastAsia="Times New Roman" w:hAnsi="Times New Roman"/>
+          <w:sz w:val="26"/>
+          <w:szCs w:val="26"/>
+        </w:rPr>
+        <w:t xml:space="preserve">[[BIEU_DO_DIEN_BIEN]]</w:t>
+      </w:r>
+    </w:p>
+    <w:p>
+      <w:pPr>
+        <w:spacing w:after="80" w:before="0" w:line="300"/>
+        <w:jc w:val="left"/>
+      </w:pPr>
+      <w:r>
+        <w:rPr>
+          <w:rFonts w:ascii="Times New Roman" w:cs="Times New Roman" w:eastAsia="Times New Roman" w:hAnsi="Times New Roman"/>
+          <w:i/>
+          <w:iCs/>
+          <w:sz w:val="22"/>
+          <w:szCs w:val="22"/>
+        </w:rPr>
+        <w:t xml:space="preserve">(Mỗi tháng lấy lần gửi gần nhất đến cuối tháng của từng đơn vị; chỉ cộng số liệu các đơn vị đã gửi)</w:t>
+      </w:r>
+    </w:p>
+    <w:p>
+      <w:pPr>
+        <w:spacing w:after="80" w:before="0" w:line="300"/>
+        <w:ind w:firstLine="567"/>
+        <w:jc w:val="both"/>
+      </w:pPr>
+      <w:r>
+        <w:rPr>
+          <w:rFonts w:ascii="Times New Roman" w:cs="Times New Roman" w:eastAsia="Times New Roman" w:hAnsi="Times New Roman"/>
+          <w:sz w:val="26"/>
+          <w:szCs w:val="26"/>
+        </w:rPr>
+        <w:t xml:space="preserve">{/co_dien_bien}</w:t>
       </w:r>
     </w:p>
     <w:p>

</xml_diff>

<commit_message>
1.0.6: bảng dự án liên xã trong Word tỉnh; soát mật độ cây trồng; PDF bản đồ vector + lưới tọa độ; thông báo hồ sơ mới được giao; bảng thửa, kiểm đếm chỉ dựng phần nhìn thấy; dọn Hạn chế lỗi thời docs/09; nâng phiên bản 1.0.6
Co-Authored-By: Claude Opus 5.5 <noreply@anthropic.com>
Claude-Session: https://claude.ai/code/session_01BZcswa4gE3voAhFCMjfJc5
</commit_message>
<xml_diff>
--- a/apps/desktop/public/mau-van-ban/bao-cao-tong-hop-tinh.docx
+++ b/apps/desktop/public/mau-van-ban/bao-cao-tong-hop-tinh.docx
@@ -1721,6 +1721,465 @@
           <w:szCs w:val="22"/>
         </w:rPr>
         <w:t xml:space="preserve">(Giá trị tạm tính là tổng các khoản phần mềm tính theo hồ sơ, chưa phải số đã phê duyệt; chi tiết: Phụ lục Excel kèm theo)</w:t>
+      </w:r>
+    </w:p>
+    <w:p>
+      <w:pPr>
+        <w:spacing w:after="80" w:before="0" w:line="300"/>
+        <w:ind w:firstLine="567"/>
+        <w:jc w:val="both"/>
+      </w:pPr>
+      <w:r>
+        <w:rPr>
+          <w:rFonts w:ascii="Times New Roman" w:cs="Times New Roman" w:eastAsia="Times New Roman" w:hAnsi="Times New Roman"/>
+          <w:sz w:val="26"/>
+          <w:szCs w:val="26"/>
+        </w:rPr>
+        <w:t xml:space="preserve">{#co_lien_xa}</w:t>
+      </w:r>
+    </w:p>
+    <w:p>
+      <w:pPr>
+        <w:spacing w:after="80" w:before="120" w:line="300"/>
+        <w:ind w:firstLine="567"/>
+        <w:jc w:val="both"/>
+      </w:pPr>
+      <w:r>
+        <w:rPr>
+          <w:rFonts w:ascii="Times New Roman" w:cs="Times New Roman" w:eastAsia="Times New Roman" w:hAnsi="Times New Roman"/>
+          <w:i/>
+          <w:iCs/>
+          <w:sz w:val="26"/>
+          <w:szCs w:val="26"/>
+        </w:rPr>
+        <w:t xml:space="preserve">Trong đó, dự án liên xã (tuyến qua nhiều xã, phường — mỗi tuyến tính là một dự án):</w:t>
+      </w:r>
+    </w:p>
+    <w:tbl>
+      <w:tblPr>
+        <w:tblW w:type="dxa" w:w="9071"/>
+        <w:tblBorders>
+          <w:top w:val="single" w:color="auto" w:sz="4"/>
+          <w:left w:val="single" w:color="auto" w:sz="4"/>
+          <w:bottom w:val="single" w:color="auto" w:sz="4"/>
+          <w:right w:val="single" w:color="auto" w:sz="4"/>
+          <w:insideH w:val="single" w:color="auto" w:sz="4"/>
+          <w:insideV w:val="single" w:color="auto" w:sz="4"/>
+        </w:tblBorders>
+      </w:tblPr>
+      <w:tblGrid>
+        <w:gridCol w:w="500"/>
+        <w:gridCol w:w="3171"/>
+        <w:gridCol w:w="1100"/>
+        <w:gridCol w:w="900"/>
+        <w:gridCol w:w="1600"/>
+        <w:gridCol w:w="1800"/>
+      </w:tblGrid>
+      <w:tr>
+        <w:trPr>
+          <w:tblHeader/>
+        </w:trPr>
+        <w:tc>
+          <w:tcPr>
+            <w:tcW w:type="dxa" w:w="500"/>
+            <w:tcBorders>
+              <w:top w:val="single" w:color="000000" w:sz="4"/>
+              <w:left w:val="single" w:color="000000" w:sz="4"/>
+              <w:bottom w:val="single" w:color="000000" w:sz="4"/>
+              <w:right w:val="single" w:color="000000" w:sz="4"/>
+            </w:tcBorders>
+            <w:tcMar>
+              <w:top w:type="dxa" w:w="40"/>
+              <w:left w:type="dxa" w:w="60"/>
+              <w:bottom w:type="dxa" w:w="40"/>
+              <w:right w:type="dxa" w:w="60"/>
+            </w:tcMar>
+            <w:vAlign w:val="center"/>
+          </w:tcPr>
+          <w:p>
+            <w:pPr>
+              <w:jc w:val="center"/>
+            </w:pPr>
+            <w:r>
+              <w:rPr>
+                <w:rFonts w:ascii="Times New Roman" w:cs="Times New Roman" w:eastAsia="Times New Roman" w:hAnsi="Times New Roman"/>
+                <w:b/>
+                <w:bCs/>
+                <w:sz w:val="22"/>
+                <w:szCs w:val="22"/>
+              </w:rPr>
+              <w:t xml:space="preserve">TT</w:t>
+            </w:r>
+          </w:p>
+        </w:tc>
+        <w:tc>
+          <w:tcPr>
+            <w:tcW w:type="dxa" w:w="3171"/>
+            <w:tcBorders>
+              <w:top w:val="single" w:color="000000" w:sz="4"/>
+              <w:left w:val="single" w:color="000000" w:sz="4"/>
+              <w:bottom w:val="single" w:color="000000" w:sz="4"/>
+              <w:right w:val="single" w:color="000000" w:sz="4"/>
+            </w:tcBorders>
+            <w:tcMar>
+              <w:top w:type="dxa" w:w="40"/>
+              <w:left w:type="dxa" w:w="60"/>
+              <w:bottom w:type="dxa" w:w="40"/>
+              <w:right w:type="dxa" w:w="60"/>
+            </w:tcMar>
+            <w:vAlign w:val="center"/>
+          </w:tcPr>
+          <w:p>
+            <w:pPr>
+              <w:jc w:val="left"/>
+            </w:pPr>
+            <w:r>
+              <w:rPr>
+                <w:rFonts w:ascii="Times New Roman" w:cs="Times New Roman" w:eastAsia="Times New Roman" w:hAnsi="Times New Roman"/>
+                <w:b/>
+                <w:bCs/>
+                <w:sz w:val="22"/>
+                <w:szCs w:val="22"/>
+              </w:rPr>
+              <w:t xml:space="preserve">Dự án liên xã (mã)</w:t>
+            </w:r>
+          </w:p>
+        </w:tc>
+        <w:tc>
+          <w:tcPr>
+            <w:tcW w:type="dxa" w:w="1100"/>
+            <w:tcBorders>
+              <w:top w:val="single" w:color="000000" w:sz="4"/>
+              <w:left w:val="single" w:color="000000" w:sz="4"/>
+              <w:bottom w:val="single" w:color="000000" w:sz="4"/>
+              <w:right w:val="single" w:color="000000" w:sz="4"/>
+            </w:tcBorders>
+            <w:tcMar>
+              <w:top w:type="dxa" w:w="40"/>
+              <w:left w:type="dxa" w:w="60"/>
+              <w:bottom w:type="dxa" w:w="40"/>
+              <w:right w:type="dxa" w:w="60"/>
+            </w:tcMar>
+            <w:vAlign w:val="center"/>
+          </w:tcPr>
+          <w:p>
+            <w:pPr>
+              <w:jc w:val="center"/>
+            </w:pPr>
+            <w:r>
+              <w:rPr>
+                <w:rFonts w:ascii="Times New Roman" w:cs="Times New Roman" w:eastAsia="Times New Roman" w:hAnsi="Times New Roman"/>
+                <w:b/>
+                <w:bCs/>
+                <w:sz w:val="22"/>
+                <w:szCs w:val="22"/>
+              </w:rPr>
+              <w:t xml:space="preserve">Xã có số liệu</w:t>
+            </w:r>
+          </w:p>
+        </w:tc>
+        <w:tc>
+          <w:tcPr>
+            <w:tcW w:type="dxa" w:w="900"/>
+            <w:tcBorders>
+              <w:top w:val="single" w:color="000000" w:sz="4"/>
+              <w:left w:val="single" w:color="000000" w:sz="4"/>
+              <w:bottom w:val="single" w:color="000000" w:sz="4"/>
+              <w:right w:val="single" w:color="000000" w:sz="4"/>
+            </w:tcBorders>
+            <w:tcMar>
+              <w:top w:type="dxa" w:w="40"/>
+              <w:left w:type="dxa" w:w="60"/>
+              <w:bottom w:type="dxa" w:w="40"/>
+              <w:right w:type="dxa" w:w="60"/>
+            </w:tcMar>
+            <w:vAlign w:val="center"/>
+          </w:tcPr>
+          <w:p>
+            <w:pPr>
+              <w:jc w:val="center"/>
+            </w:pPr>
+            <w:r>
+              <w:rPr>
+                <w:rFonts w:ascii="Times New Roman" w:cs="Times New Roman" w:eastAsia="Times New Roman" w:hAnsi="Times New Roman"/>
+                <w:b/>
+                <w:bCs/>
+                <w:sz w:val="22"/>
+                <w:szCs w:val="22"/>
+              </w:rPr>
+              <w:t xml:space="preserve">Số hộ</w:t>
+            </w:r>
+          </w:p>
+        </w:tc>
+        <w:tc>
+          <w:tcPr>
+            <w:tcW w:type="dxa" w:w="1600"/>
+            <w:tcBorders>
+              <w:top w:val="single" w:color="000000" w:sz="4"/>
+              <w:left w:val="single" w:color="000000" w:sz="4"/>
+              <w:bottom w:val="single" w:color="000000" w:sz="4"/>
+              <w:right w:val="single" w:color="000000" w:sz="4"/>
+            </w:tcBorders>
+            <w:tcMar>
+              <w:top w:type="dxa" w:w="40"/>
+              <w:left w:type="dxa" w:w="60"/>
+              <w:bottom w:type="dxa" w:w="40"/>
+              <w:right w:type="dxa" w:w="60"/>
+            </w:tcMar>
+            <w:vAlign w:val="center"/>
+          </w:tcPr>
+          <w:p>
+            <w:pPr>
+              <w:jc w:val="center"/>
+            </w:pPr>
+            <w:r>
+              <w:rPr>
+                <w:rFonts w:ascii="Times New Roman" w:cs="Times New Roman" w:eastAsia="Times New Roman" w:hAnsi="Times New Roman"/>
+                <w:b/>
+                <w:bCs/>
+                <w:sz w:val="22"/>
+                <w:szCs w:val="22"/>
+              </w:rPr>
+              <w:t xml:space="preserve">Đã bàn giao MB (hộ, %)</w:t>
+            </w:r>
+          </w:p>
+        </w:tc>
+        <w:tc>
+          <w:tcPr>
+            <w:tcW w:type="dxa" w:w="1800"/>
+            <w:tcBorders>
+              <w:top w:val="single" w:color="000000" w:sz="4"/>
+              <w:left w:val="single" w:color="000000" w:sz="4"/>
+              <w:bottom w:val="single" w:color="000000" w:sz="4"/>
+              <w:right w:val="single" w:color="000000" w:sz="4"/>
+            </w:tcBorders>
+            <w:tcMar>
+              <w:top w:type="dxa" w:w="40"/>
+              <w:left w:type="dxa" w:w="60"/>
+              <w:bottom w:type="dxa" w:w="40"/>
+              <w:right w:type="dxa" w:w="60"/>
+            </w:tcMar>
+            <w:vAlign w:val="center"/>
+          </w:tcPr>
+          <w:p>
+            <w:pPr>
+              <w:jc w:val="center"/>
+            </w:pPr>
+            <w:r>
+              <w:rPr>
+                <w:rFonts w:ascii="Times New Roman" w:cs="Times New Roman" w:eastAsia="Times New Roman" w:hAnsi="Times New Roman"/>
+                <w:b/>
+                <w:bCs/>
+                <w:sz w:val="22"/>
+                <w:szCs w:val="22"/>
+              </w:rPr>
+              <w:t xml:space="preserve">Xã chưa có số liệu</w:t>
+            </w:r>
+          </w:p>
+        </w:tc>
+      </w:tr>
+      <w:tr>
+        <w:tc>
+          <w:tcPr>
+            <w:tcW w:type="dxa" w:w="500"/>
+            <w:tcBorders>
+              <w:top w:val="single" w:color="000000" w:sz="4"/>
+              <w:left w:val="single" w:color="000000" w:sz="4"/>
+              <w:bottom w:val="single" w:color="000000" w:sz="4"/>
+              <w:right w:val="single" w:color="000000" w:sz="4"/>
+            </w:tcBorders>
+            <w:tcMar>
+              <w:top w:type="dxa" w:w="40"/>
+              <w:left w:type="dxa" w:w="60"/>
+              <w:bottom w:type="dxa" w:w="40"/>
+              <w:right w:type="dxa" w:w="60"/>
+            </w:tcMar>
+            <w:vAlign w:val="center"/>
+          </w:tcPr>
+          <w:p>
+            <w:pPr>
+              <w:jc w:val="center"/>
+            </w:pPr>
+            <w:r>
+              <w:rPr>
+                <w:rFonts w:ascii="Times New Roman" w:cs="Times New Roman" w:eastAsia="Times New Roman" w:hAnsi="Times New Roman"/>
+                <w:sz w:val="22"/>
+                <w:szCs w:val="22"/>
+              </w:rPr>
+              <w:t xml:space="preserve">{#lien_xa}{tt}</w:t>
+            </w:r>
+          </w:p>
+        </w:tc>
+        <w:tc>
+          <w:tcPr>
+            <w:tcW w:type="dxa" w:w="3171"/>
+            <w:tcBorders>
+              <w:top w:val="single" w:color="000000" w:sz="4"/>
+              <w:left w:val="single" w:color="000000" w:sz="4"/>
+              <w:bottom w:val="single" w:color="000000" w:sz="4"/>
+              <w:right w:val="single" w:color="000000" w:sz="4"/>
+            </w:tcBorders>
+            <w:tcMar>
+              <w:top w:type="dxa" w:w="40"/>
+              <w:left w:type="dxa" w:w="60"/>
+              <w:bottom w:type="dxa" w:w="40"/>
+              <w:right w:type="dxa" w:w="60"/>
+            </w:tcMar>
+            <w:vAlign w:val="center"/>
+          </w:tcPr>
+          <w:p>
+            <w:pPr>
+              <w:jc w:val="left"/>
+            </w:pPr>
+            <w:r>
+              <w:rPr>
+                <w:rFonts w:ascii="Times New Roman" w:cs="Times New Roman" w:eastAsia="Times New Roman" w:hAnsi="Times New Roman"/>
+                <w:sz w:val="22"/>
+                <w:szCs w:val="22"/>
+              </w:rPr>
+              <w:t xml:space="preserve">{ten} ({ma})</w:t>
+            </w:r>
+          </w:p>
+        </w:tc>
+        <w:tc>
+          <w:tcPr>
+            <w:tcW w:type="dxa" w:w="1100"/>
+            <w:tcBorders>
+              <w:top w:val="single" w:color="000000" w:sz="4"/>
+              <w:left w:val="single" w:color="000000" w:sz="4"/>
+              <w:bottom w:val="single" w:color="000000" w:sz="4"/>
+              <w:right w:val="single" w:color="000000" w:sz="4"/>
+            </w:tcBorders>
+            <w:tcMar>
+              <w:top w:type="dxa" w:w="40"/>
+              <w:left w:type="dxa" w:w="60"/>
+              <w:bottom w:type="dxa" w:w="40"/>
+              <w:right w:type="dxa" w:w="60"/>
+            </w:tcMar>
+            <w:vAlign w:val="center"/>
+          </w:tcPr>
+          <w:p>
+            <w:pPr>
+              <w:jc w:val="right"/>
+            </w:pPr>
+            <w:r>
+              <w:rPr>
+                <w:rFonts w:ascii="Times New Roman" w:cs="Times New Roman" w:eastAsia="Times New Roman" w:hAnsi="Times New Roman"/>
+                <w:sz w:val="22"/>
+                <w:szCs w:val="22"/>
+              </w:rPr>
+              <w:t xml:space="preserve">{so_xa}</w:t>
+            </w:r>
+          </w:p>
+        </w:tc>
+        <w:tc>
+          <w:tcPr>
+            <w:tcW w:type="dxa" w:w="900"/>
+            <w:tcBorders>
+              <w:top w:val="single" w:color="000000" w:sz="4"/>
+              <w:left w:val="single" w:color="000000" w:sz="4"/>
+              <w:bottom w:val="single" w:color="000000" w:sz="4"/>
+              <w:right w:val="single" w:color="000000" w:sz="4"/>
+            </w:tcBorders>
+            <w:tcMar>
+              <w:top w:type="dxa" w:w="40"/>
+              <w:left w:type="dxa" w:w="60"/>
+              <w:bottom w:type="dxa" w:w="40"/>
+              <w:right w:type="dxa" w:w="60"/>
+            </w:tcMar>
+            <w:vAlign w:val="center"/>
+          </w:tcPr>
+          <w:p>
+            <w:pPr>
+              <w:jc w:val="right"/>
+            </w:pPr>
+            <w:r>
+              <w:rPr>
+                <w:rFonts w:ascii="Times New Roman" w:cs="Times New Roman" w:eastAsia="Times New Roman" w:hAnsi="Times New Roman"/>
+                <w:sz w:val="22"/>
+                <w:szCs w:val="22"/>
+              </w:rPr>
+              <w:t xml:space="preserve">{so_ho}</w:t>
+            </w:r>
+          </w:p>
+        </w:tc>
+        <w:tc>
+          <w:tcPr>
+            <w:tcW w:type="dxa" w:w="1600"/>
+            <w:tcBorders>
+              <w:top w:val="single" w:color="000000" w:sz="4"/>
+              <w:left w:val="single" w:color="000000" w:sz="4"/>
+              <w:bottom w:val="single" w:color="000000" w:sz="4"/>
+              <w:right w:val="single" w:color="000000" w:sz="4"/>
+            </w:tcBorders>
+            <w:tcMar>
+              <w:top w:type="dxa" w:w="40"/>
+              <w:left w:type="dxa" w:w="60"/>
+              <w:bottom w:type="dxa" w:w="40"/>
+              <w:right w:type="dxa" w:w="60"/>
+            </w:tcMar>
+            <w:vAlign w:val="center"/>
+          </w:tcPr>
+          <w:p>
+            <w:pPr>
+              <w:jc w:val="right"/>
+            </w:pPr>
+            <w:r>
+              <w:rPr>
+                <w:rFonts w:ascii="Times New Roman" w:cs="Times New Roman" w:eastAsia="Times New Roman" w:hAnsi="Times New Roman"/>
+                <w:sz w:val="22"/>
+                <w:szCs w:val="22"/>
+              </w:rPr>
+              <w:t xml:space="preserve">{ban_giao}</w:t>
+            </w:r>
+          </w:p>
+        </w:tc>
+        <w:tc>
+          <w:tcPr>
+            <w:tcW w:type="dxa" w:w="1800"/>
+            <w:tcBorders>
+              <w:top w:val="single" w:color="000000" w:sz="4"/>
+              <w:left w:val="single" w:color="000000" w:sz="4"/>
+              <w:bottom w:val="single" w:color="000000" w:sz="4"/>
+              <w:right w:val="single" w:color="000000" w:sz="4"/>
+            </w:tcBorders>
+            <w:tcMar>
+              <w:top w:type="dxa" w:w="40"/>
+              <w:left w:type="dxa" w:w="60"/>
+              <w:bottom w:type="dxa" w:w="40"/>
+              <w:right w:type="dxa" w:w="60"/>
+            </w:tcMar>
+            <w:vAlign w:val="center"/>
+          </w:tcPr>
+          <w:p>
+            <w:pPr>
+              <w:jc w:val="right"/>
+            </w:pPr>
+            <w:r>
+              <w:rPr>
+                <w:rFonts w:ascii="Times New Roman" w:cs="Times New Roman" w:eastAsia="Times New Roman" w:hAnsi="Times New Roman"/>
+                <w:sz w:val="22"/>
+                <w:szCs w:val="22"/>
+              </w:rPr>
+              <w:t xml:space="preserve">{xa_thieu}{/lien_xa}</w:t>
+            </w:r>
+          </w:p>
+        </w:tc>
+      </w:tr>
+    </w:tbl>
+    <w:p>
+      <w:pPr>
+        <w:spacing w:after="80" w:before="0" w:line="300"/>
+        <w:ind w:firstLine="567"/>
+        <w:jc w:val="both"/>
+      </w:pPr>
+      <w:r>
+        <w:rPr>
+          <w:rFonts w:ascii="Times New Roman" w:cs="Times New Roman" w:eastAsia="Times New Roman" w:hAnsi="Times New Roman"/>
+          <w:sz w:val="26"/>
+          <w:szCs w:val="26"/>
+        </w:rPr>
+        <w:t xml:space="preserve">{/co_lien_xa}</w:t>
       </w:r>
     </w:p>
     <w:p>

</xml_diff>

<commit_message>
Phát hành 1.0.16: tiến độ thủ tục thêm chi trả, bàn giao; hạn QĐ thu hồi cho dự án không chia đợt; bảng khâu thủ tục quá hạn trong báo cáo Word, Excel tỉnh; kiểm thử giao diện cột hạn theo đợt, hộp quá hạn ở tỉnh
Co-Authored-By: Claude Opus 5.5 <noreply@anthropic.com>
Claude-Session: https://claude.ai/code/session_01BZcswa4gE3voAhFCMjfJc5
</commit_message>
<xml_diff>
--- a/apps/desktop/public/mau-van-ban/bao-cao-tong-hop-tinh.docx
+++ b/apps/desktop/public/mau-van-ban/bao-cao-tong-hop-tinh.docx
@@ -2890,6 +2890,479 @@
           <w:szCs w:val="26"/>
         </w:rPr>
         <w:t xml:space="preserve">{/co_vuong_mac}</w:t>
+      </w:r>
+    </w:p>
+    <w:p>
+      <w:pPr>
+        <w:spacing w:after="80" w:before="0" w:line="300"/>
+        <w:ind w:firstLine="567"/>
+        <w:jc w:val="both"/>
+      </w:pPr>
+      <w:r>
+        <w:rPr>
+          <w:rFonts w:ascii="Times New Roman" w:cs="Times New Roman" w:eastAsia="Times New Roman" w:hAnsi="Times New Roman"/>
+          <w:sz w:val="26"/>
+          <w:szCs w:val="26"/>
+        </w:rPr>
+        <w:t xml:space="preserve">{#co_qua_han}</w:t>
+      </w:r>
+    </w:p>
+    <w:p>
+      <w:pPr>
+        <w:spacing w:after="80" w:before="0" w:line="300"/>
+        <w:ind w:firstLine="567"/>
+        <w:jc w:val="both"/>
+      </w:pPr>
+      <w:r>
+        <w:rPr>
+          <w:rFonts w:ascii="Times New Roman" w:cs="Times New Roman" w:eastAsia="Times New Roman" w:hAnsi="Times New Roman"/>
+          <w:sz w:val="26"/>
+          <w:szCs w:val="26"/>
+        </w:rPr>
+        <w:t xml:space="preserve">Có {tong_qua_han} khâu thủ tục quá hạn theo số liệu các đơn vị đã ghi nhận:</w:t>
+      </w:r>
+    </w:p>
+    <w:tbl>
+      <w:tblPr>
+        <w:tblW w:type="dxa" w:w="9071"/>
+        <w:tblBorders>
+          <w:top w:val="single" w:color="auto" w:sz="4"/>
+          <w:left w:val="single" w:color="auto" w:sz="4"/>
+          <w:bottom w:val="single" w:color="auto" w:sz="4"/>
+          <w:right w:val="single" w:color="auto" w:sz="4"/>
+          <w:insideH w:val="single" w:color="auto" w:sz="4"/>
+          <w:insideV w:val="single" w:color="auto" w:sz="4"/>
+        </w:tblBorders>
+      </w:tblPr>
+      <w:tblGrid>
+        <w:gridCol w:w="500"/>
+        <w:gridCol w:w="2671"/>
+        <w:gridCol w:w="1500"/>
+        <w:gridCol w:w="1900"/>
+        <w:gridCol w:w="1100"/>
+        <w:gridCol w:w="1400"/>
+      </w:tblGrid>
+      <w:tr>
+        <w:trPr>
+          <w:tblHeader/>
+        </w:trPr>
+        <w:tc>
+          <w:tcPr>
+            <w:tcW w:type="dxa" w:w="500"/>
+            <w:tcBorders>
+              <w:top w:val="single" w:color="000000" w:sz="4"/>
+              <w:left w:val="single" w:color="000000" w:sz="4"/>
+              <w:bottom w:val="single" w:color="000000" w:sz="4"/>
+              <w:right w:val="single" w:color="000000" w:sz="4"/>
+            </w:tcBorders>
+            <w:tcMar>
+              <w:top w:type="dxa" w:w="40"/>
+              <w:left w:type="dxa" w:w="60"/>
+              <w:bottom w:type="dxa" w:w="40"/>
+              <w:right w:type="dxa" w:w="60"/>
+            </w:tcMar>
+            <w:vAlign w:val="center"/>
+          </w:tcPr>
+          <w:p>
+            <w:pPr>
+              <w:jc w:val="center"/>
+            </w:pPr>
+            <w:r>
+              <w:rPr>
+                <w:rFonts w:ascii="Times New Roman" w:cs="Times New Roman" w:eastAsia="Times New Roman" w:hAnsi="Times New Roman"/>
+                <w:b/>
+                <w:bCs/>
+                <w:sz w:val="22"/>
+                <w:szCs w:val="22"/>
+              </w:rPr>
+              <w:t xml:space="preserve">TT</w:t>
+            </w:r>
+          </w:p>
+        </w:tc>
+        <w:tc>
+          <w:tcPr>
+            <w:tcW w:type="dxa" w:w="2671"/>
+            <w:tcBorders>
+              <w:top w:val="single" w:color="000000" w:sz="4"/>
+              <w:left w:val="single" w:color="000000" w:sz="4"/>
+              <w:bottom w:val="single" w:color="000000" w:sz="4"/>
+              <w:right w:val="single" w:color="000000" w:sz="4"/>
+            </w:tcBorders>
+            <w:tcMar>
+              <w:top w:type="dxa" w:w="40"/>
+              <w:left w:type="dxa" w:w="60"/>
+              <w:bottom w:type="dxa" w:w="40"/>
+              <w:right w:type="dxa" w:w="60"/>
+            </w:tcMar>
+            <w:vAlign w:val="center"/>
+          </w:tcPr>
+          <w:p>
+            <w:pPr>
+              <w:jc w:val="left"/>
+            </w:pPr>
+            <w:r>
+              <w:rPr>
+                <w:rFonts w:ascii="Times New Roman" w:cs="Times New Roman" w:eastAsia="Times New Roman" w:hAnsi="Times New Roman"/>
+                <w:b/>
+                <w:bCs/>
+                <w:sz w:val="22"/>
+                <w:szCs w:val="22"/>
+              </w:rPr>
+              <w:t xml:space="preserve">Dự án (xã, phường)</w:t>
+            </w:r>
+          </w:p>
+        </w:tc>
+        <w:tc>
+          <w:tcPr>
+            <w:tcW w:type="dxa" w:w="1500"/>
+            <w:tcBorders>
+              <w:top w:val="single" w:color="000000" w:sz="4"/>
+              <w:left w:val="single" w:color="000000" w:sz="4"/>
+              <w:bottom w:val="single" w:color="000000" w:sz="4"/>
+              <w:right w:val="single" w:color="000000" w:sz="4"/>
+            </w:tcBorders>
+            <w:tcMar>
+              <w:top w:type="dxa" w:w="40"/>
+              <w:left w:type="dxa" w:w="60"/>
+              <w:bottom w:type="dxa" w:w="40"/>
+              <w:right w:type="dxa" w:w="60"/>
+            </w:tcMar>
+            <w:vAlign w:val="center"/>
+          </w:tcPr>
+          <w:p>
+            <w:pPr>
+              <w:jc w:val="center"/>
+            </w:pPr>
+            <w:r>
+              <w:rPr>
+                <w:rFonts w:ascii="Times New Roman" w:cs="Times New Roman" w:eastAsia="Times New Roman" w:hAnsi="Times New Roman"/>
+                <w:b/>
+                <w:bCs/>
+                <w:sz w:val="22"/>
+                <w:szCs w:val="22"/>
+              </w:rPr>
+              <w:t xml:space="preserve">Bản phương án / đợt</w:t>
+            </w:r>
+          </w:p>
+        </w:tc>
+        <w:tc>
+          <w:tcPr>
+            <w:tcW w:type="dxa" w:w="1900"/>
+            <w:tcBorders>
+              <w:top w:val="single" w:color="000000" w:sz="4"/>
+              <w:left w:val="single" w:color="000000" w:sz="4"/>
+              <w:bottom w:val="single" w:color="000000" w:sz="4"/>
+              <w:right w:val="single" w:color="000000" w:sz="4"/>
+            </w:tcBorders>
+            <w:tcMar>
+              <w:top w:type="dxa" w:w="40"/>
+              <w:left w:type="dxa" w:w="60"/>
+              <w:bottom w:type="dxa" w:w="40"/>
+              <w:right w:type="dxa" w:w="60"/>
+            </w:tcMar>
+            <w:vAlign w:val="center"/>
+          </w:tcPr>
+          <w:p>
+            <w:pPr>
+              <w:jc w:val="center"/>
+            </w:pPr>
+            <w:r>
+              <w:rPr>
+                <w:rFonts w:ascii="Times New Roman" w:cs="Times New Roman" w:eastAsia="Times New Roman" w:hAnsi="Times New Roman"/>
+                <w:b/>
+                <w:bCs/>
+                <w:sz w:val="22"/>
+                <w:szCs w:val="22"/>
+              </w:rPr>
+              <w:t xml:space="preserve">Khâu</w:t>
+            </w:r>
+          </w:p>
+        </w:tc>
+        <w:tc>
+          <w:tcPr>
+            <w:tcW w:type="dxa" w:w="1100"/>
+            <w:tcBorders>
+              <w:top w:val="single" w:color="000000" w:sz="4"/>
+              <w:left w:val="single" w:color="000000" w:sz="4"/>
+              <w:bottom w:val="single" w:color="000000" w:sz="4"/>
+              <w:right w:val="single" w:color="000000" w:sz="4"/>
+            </w:tcBorders>
+            <w:tcMar>
+              <w:top w:type="dxa" w:w="40"/>
+              <w:left w:type="dxa" w:w="60"/>
+              <w:bottom w:type="dxa" w:w="40"/>
+              <w:right w:type="dxa" w:w="60"/>
+            </w:tcMar>
+            <w:vAlign w:val="center"/>
+          </w:tcPr>
+          <w:p>
+            <w:pPr>
+              <w:jc w:val="center"/>
+            </w:pPr>
+            <w:r>
+              <w:rPr>
+                <w:rFonts w:ascii="Times New Roman" w:cs="Times New Roman" w:eastAsia="Times New Roman" w:hAnsi="Times New Roman"/>
+                <w:b/>
+                <w:bCs/>
+                <w:sz w:val="22"/>
+                <w:szCs w:val="22"/>
+              </w:rPr>
+              <w:t xml:space="preserve">Hạn</w:t>
+            </w:r>
+          </w:p>
+        </w:tc>
+        <w:tc>
+          <w:tcPr>
+            <w:tcW w:type="dxa" w:w="1400"/>
+            <w:tcBorders>
+              <w:top w:val="single" w:color="000000" w:sz="4"/>
+              <w:left w:val="single" w:color="000000" w:sz="4"/>
+              <w:bottom w:val="single" w:color="000000" w:sz="4"/>
+              <w:right w:val="single" w:color="000000" w:sz="4"/>
+            </w:tcBorders>
+            <w:tcMar>
+              <w:top w:type="dxa" w:w="40"/>
+              <w:left w:type="dxa" w:w="60"/>
+              <w:bottom w:type="dxa" w:w="40"/>
+              <w:right w:type="dxa" w:w="60"/>
+            </w:tcMar>
+            <w:vAlign w:val="center"/>
+          </w:tcPr>
+          <w:p>
+            <w:pPr>
+              <w:jc w:val="center"/>
+            </w:pPr>
+            <w:r>
+              <w:rPr>
+                <w:rFonts w:ascii="Times New Roman" w:cs="Times New Roman" w:eastAsia="Times New Roman" w:hAnsi="Times New Roman"/>
+                <w:b/>
+                <w:bCs/>
+                <w:sz w:val="22"/>
+                <w:szCs w:val="22"/>
+              </w:rPr>
+              <w:t xml:space="preserve">Căn cứ</w:t>
+            </w:r>
+          </w:p>
+        </w:tc>
+      </w:tr>
+      <w:tr>
+        <w:tc>
+          <w:tcPr>
+            <w:tcW w:type="dxa" w:w="500"/>
+            <w:tcBorders>
+              <w:top w:val="single" w:color="000000" w:sz="4"/>
+              <w:left w:val="single" w:color="000000" w:sz="4"/>
+              <w:bottom w:val="single" w:color="000000" w:sz="4"/>
+              <w:right w:val="single" w:color="000000" w:sz="4"/>
+            </w:tcBorders>
+            <w:tcMar>
+              <w:top w:type="dxa" w:w="40"/>
+              <w:left w:type="dxa" w:w="60"/>
+              <w:bottom w:type="dxa" w:w="40"/>
+              <w:right w:type="dxa" w:w="60"/>
+            </w:tcMar>
+            <w:vAlign w:val="center"/>
+          </w:tcPr>
+          <w:p>
+            <w:pPr>
+              <w:jc w:val="center"/>
+            </w:pPr>
+            <w:r>
+              <w:rPr>
+                <w:rFonts w:ascii="Times New Roman" w:cs="Times New Roman" w:eastAsia="Times New Roman" w:hAnsi="Times New Roman"/>
+                <w:sz w:val="22"/>
+                <w:szCs w:val="22"/>
+              </w:rPr>
+              <w:t xml:space="preserve">{#qua_han}{tt}</w:t>
+            </w:r>
+          </w:p>
+        </w:tc>
+        <w:tc>
+          <w:tcPr>
+            <w:tcW w:type="dxa" w:w="2671"/>
+            <w:tcBorders>
+              <w:top w:val="single" w:color="000000" w:sz="4"/>
+              <w:left w:val="single" w:color="000000" w:sz="4"/>
+              <w:bottom w:val="single" w:color="000000" w:sz="4"/>
+              <w:right w:val="single" w:color="000000" w:sz="4"/>
+            </w:tcBorders>
+            <w:tcMar>
+              <w:top w:type="dxa" w:w="40"/>
+              <w:left w:type="dxa" w:w="60"/>
+              <w:bottom w:type="dxa" w:w="40"/>
+              <w:right w:type="dxa" w:w="60"/>
+            </w:tcMar>
+            <w:vAlign w:val="center"/>
+          </w:tcPr>
+          <w:p>
+            <w:pPr>
+              <w:jc w:val="left"/>
+            </w:pPr>
+            <w:r>
+              <w:rPr>
+                <w:rFonts w:ascii="Times New Roman" w:cs="Times New Roman" w:eastAsia="Times New Roman" w:hAnsi="Times New Roman"/>
+                <w:sz w:val="22"/>
+                <w:szCs w:val="22"/>
+              </w:rPr>
+              <w:t xml:space="preserve">{du_an}</w:t>
+            </w:r>
+          </w:p>
+        </w:tc>
+        <w:tc>
+          <w:tcPr>
+            <w:tcW w:type="dxa" w:w="1500"/>
+            <w:tcBorders>
+              <w:top w:val="single" w:color="000000" w:sz="4"/>
+              <w:left w:val="single" w:color="000000" w:sz="4"/>
+              <w:bottom w:val="single" w:color="000000" w:sz="4"/>
+              <w:right w:val="single" w:color="000000" w:sz="4"/>
+            </w:tcBorders>
+            <w:tcMar>
+              <w:top w:type="dxa" w:w="40"/>
+              <w:left w:type="dxa" w:w="60"/>
+              <w:bottom w:type="dxa" w:w="40"/>
+              <w:right w:type="dxa" w:w="60"/>
+            </w:tcMar>
+            <w:vAlign w:val="center"/>
+          </w:tcPr>
+          <w:p>
+            <w:pPr>
+              <w:jc w:val="right"/>
+            </w:pPr>
+            <w:r>
+              <w:rPr>
+                <w:rFonts w:ascii="Times New Roman" w:cs="Times New Roman" w:eastAsia="Times New Roman" w:hAnsi="Times New Roman"/>
+                <w:sz w:val="22"/>
+                <w:szCs w:val="22"/>
+              </w:rPr>
+              <w:t xml:space="preserve">{doi_tuong}</w:t>
+            </w:r>
+          </w:p>
+        </w:tc>
+        <w:tc>
+          <w:tcPr>
+            <w:tcW w:type="dxa" w:w="1900"/>
+            <w:tcBorders>
+              <w:top w:val="single" w:color="000000" w:sz="4"/>
+              <w:left w:val="single" w:color="000000" w:sz="4"/>
+              <w:bottom w:val="single" w:color="000000" w:sz="4"/>
+              <w:right w:val="single" w:color="000000" w:sz="4"/>
+            </w:tcBorders>
+            <w:tcMar>
+              <w:top w:type="dxa" w:w="40"/>
+              <w:left w:type="dxa" w:w="60"/>
+              <w:bottom w:type="dxa" w:w="40"/>
+              <w:right w:type="dxa" w:w="60"/>
+            </w:tcMar>
+            <w:vAlign w:val="center"/>
+          </w:tcPr>
+          <w:p>
+            <w:pPr>
+              <w:jc w:val="right"/>
+            </w:pPr>
+            <w:r>
+              <w:rPr>
+                <w:rFonts w:ascii="Times New Roman" w:cs="Times New Roman" w:eastAsia="Times New Roman" w:hAnsi="Times New Roman"/>
+                <w:sz w:val="22"/>
+                <w:szCs w:val="22"/>
+              </w:rPr>
+              <w:t xml:space="preserve">{khau}</w:t>
+            </w:r>
+          </w:p>
+        </w:tc>
+        <w:tc>
+          <w:tcPr>
+            <w:tcW w:type="dxa" w:w="1100"/>
+            <w:tcBorders>
+              <w:top w:val="single" w:color="000000" w:sz="4"/>
+              <w:left w:val="single" w:color="000000" w:sz="4"/>
+              <w:bottom w:val="single" w:color="000000" w:sz="4"/>
+              <w:right w:val="single" w:color="000000" w:sz="4"/>
+            </w:tcBorders>
+            <w:tcMar>
+              <w:top w:type="dxa" w:w="40"/>
+              <w:left w:type="dxa" w:w="60"/>
+              <w:bottom w:type="dxa" w:w="40"/>
+              <w:right w:type="dxa" w:w="60"/>
+            </w:tcMar>
+            <w:vAlign w:val="center"/>
+          </w:tcPr>
+          <w:p>
+            <w:pPr>
+              <w:jc w:val="right"/>
+            </w:pPr>
+            <w:r>
+              <w:rPr>
+                <w:rFonts w:ascii="Times New Roman" w:cs="Times New Roman" w:eastAsia="Times New Roman" w:hAnsi="Times New Roman"/>
+                <w:sz w:val="22"/>
+                <w:szCs w:val="22"/>
+              </w:rPr>
+              <w:t xml:space="preserve">{han}</w:t>
+            </w:r>
+          </w:p>
+        </w:tc>
+        <w:tc>
+          <w:tcPr>
+            <w:tcW w:type="dxa" w:w="1400"/>
+            <w:tcBorders>
+              <w:top w:val="single" w:color="000000" w:sz="4"/>
+              <w:left w:val="single" w:color="000000" w:sz="4"/>
+              <w:bottom w:val="single" w:color="000000" w:sz="4"/>
+              <w:right w:val="single" w:color="000000" w:sz="4"/>
+            </w:tcBorders>
+            <w:tcMar>
+              <w:top w:type="dxa" w:w="40"/>
+              <w:left w:type="dxa" w:w="60"/>
+              <w:bottom w:type="dxa" w:w="40"/>
+              <w:right w:type="dxa" w:w="60"/>
+            </w:tcMar>
+            <w:vAlign w:val="center"/>
+          </w:tcPr>
+          <w:p>
+            <w:pPr>
+              <w:jc w:val="right"/>
+            </w:pPr>
+            <w:r>
+              <w:rPr>
+                <w:rFonts w:ascii="Times New Roman" w:cs="Times New Roman" w:eastAsia="Times New Roman" w:hAnsi="Times New Roman"/>
+                <w:sz w:val="22"/>
+                <w:szCs w:val="22"/>
+              </w:rPr>
+              <w:t xml:space="preserve">{can_cu}{/qua_han}</w:t>
+            </w:r>
+          </w:p>
+        </w:tc>
+      </w:tr>
+    </w:tbl>
+    <w:p>
+      <w:pPr>
+        <w:spacing w:after="80" w:before="60" w:line="300"/>
+        <w:jc w:val="left"/>
+      </w:pPr>
+      <w:r>
+        <w:rPr>
+          <w:rFonts w:ascii="Times New Roman" w:cs="Times New Roman" w:eastAsia="Times New Roman" w:hAnsi="Times New Roman"/>
+          <w:i/>
+          <w:iCs/>
+          <w:sz w:val="22"/>
+          <w:szCs w:val="22"/>
+        </w:rPr>
+        <w:t xml:space="preserve">(Hạn tính theo ngày đơn vị ghi nhận và lịch ngày nghỉ đơn vị gửi kèm gói; dự án gửi từ phiên bản trước 1.0.15 không có số liệu này)</w:t>
+      </w:r>
+    </w:p>
+    <w:p>
+      <w:pPr>
+        <w:spacing w:after="80" w:before="0" w:line="300"/>
+        <w:ind w:firstLine="567"/>
+        <w:jc w:val="both"/>
+      </w:pPr>
+      <w:r>
+        <w:rPr>
+          <w:rFonts w:ascii="Times New Roman" w:cs="Times New Roman" w:eastAsia="Times New Roman" w:hAnsi="Times New Roman"/>
+          <w:sz w:val="26"/>
+          <w:szCs w:val="26"/>
+        </w:rPr>
+        <w:t xml:space="preserve">{/co_qua_han}</w:t>
       </w:r>
     </w:p>
     <w:p>

</xml_diff>

<commit_message>
1.2.0 (D1–D3): PDF bản đồ tiến độ viền thửa đã giao chủ đầu tư; báo cáo Word cấp xã có tiến độ theo tháng (biểu đồ), đơn quá hạn, lịch cưỡng chế; báo cáo, màn tỉnh có đơn khiếu nại theo tháng và lịch cưỡng chế (gói tỉnh chỉ ngày, loại)
Co-Authored-By: Claude Opus 5.5 <noreply@anthropic.com>
Claude-Session: https://claude.ai/code/session_01BZcswa4gE3voAhFCMjfJc5
</commit_message>
<xml_diff>
--- a/apps/desktop/public/mau-van-ban/bao-cao-tong-hop-tinh.docx
+++ b/apps/desktop/public/mau-van-ban/bao-cao-tong-hop-tinh.docx
@@ -3363,6 +3363,141 @@
           <w:szCs w:val="26"/>
         </w:rPr>
         <w:t xml:space="preserve">{/co_qua_han}</w:t>
+      </w:r>
+    </w:p>
+    <w:p>
+      <w:pPr>
+        <w:spacing w:after="80" w:before="0" w:line="300"/>
+        <w:ind w:firstLine="567"/>
+        <w:jc w:val="both"/>
+      </w:pPr>
+      <w:r>
+        <w:rPr>
+          <w:rFonts w:ascii="Times New Roman" w:cs="Times New Roman" w:eastAsia="Times New Roman" w:hAnsi="Times New Roman"/>
+          <w:sz w:val="26"/>
+          <w:szCs w:val="26"/>
+        </w:rPr>
+        <w:t xml:space="preserve">{#co_don_thang}</w:t>
+      </w:r>
+    </w:p>
+    <w:p>
+      <w:pPr>
+        <w:spacing w:after="80" w:before="0" w:line="300"/>
+        <w:ind w:firstLine="567"/>
+        <w:jc w:val="both"/>
+      </w:pPr>
+      <w:r>
+        <w:rPr>
+          <w:rFonts w:ascii="Times New Roman" w:cs="Times New Roman" w:eastAsia="Times New Roman" w:hAnsi="Times New Roman"/>
+          <w:sz w:val="26"/>
+          <w:szCs w:val="26"/>
+        </w:rPr>
+        <w:t xml:space="preserve">{cau_don_thang}</w:t>
+      </w:r>
+    </w:p>
+    <w:p>
+      <w:pPr>
+        <w:spacing w:after="80" w:before="0" w:line="300"/>
+        <w:ind w:firstLine="567"/>
+        <w:jc w:val="both"/>
+      </w:pPr>
+      <w:r>
+        <w:rPr>
+          <w:rFonts w:ascii="Times New Roman" w:cs="Times New Roman" w:eastAsia="Times New Roman" w:hAnsi="Times New Roman"/>
+          <w:sz w:val="26"/>
+          <w:szCs w:val="26"/>
+        </w:rPr>
+        <w:t xml:space="preserve">{/co_don_thang}</w:t>
+      </w:r>
+    </w:p>
+    <w:p>
+      <w:pPr>
+        <w:spacing w:after="80" w:before="0" w:line="300"/>
+        <w:ind w:firstLine="567"/>
+        <w:jc w:val="both"/>
+      </w:pPr>
+      <w:r>
+        <w:rPr>
+          <w:rFonts w:ascii="Times New Roman" w:cs="Times New Roman" w:eastAsia="Times New Roman" w:hAnsi="Times New Roman"/>
+          <w:sz w:val="26"/>
+          <w:szCs w:val="26"/>
+        </w:rPr>
+        <w:t xml:space="preserve">{#co_lich_cc}</w:t>
+      </w:r>
+    </w:p>
+    <w:p>
+      <w:pPr>
+        <w:spacing w:after="80" w:before="0" w:line="300"/>
+        <w:ind w:firstLine="567"/>
+        <w:jc w:val="both"/>
+      </w:pPr>
+      <w:r>
+        <w:rPr>
+          <w:rFonts w:ascii="Times New Roman" w:cs="Times New Roman" w:eastAsia="Times New Roman" w:hAnsi="Times New Roman"/>
+          <w:sz w:val="26"/>
+          <w:szCs w:val="26"/>
+        </w:rPr>
+        <w:t xml:space="preserve">Lịch cưỡng chế ({so_lich_cc} hồ sơ chưa kết thúc, đơn vị đã ghi ngày dự kiến):</w:t>
+      </w:r>
+    </w:p>
+    <w:p>
+      <w:pPr>
+        <w:spacing w:after="80" w:before="0" w:line="300"/>
+        <w:ind w:firstLine="567"/>
+        <w:jc w:val="both"/>
+      </w:pPr>
+      <w:r>
+        <w:rPr>
+          <w:rFonts w:ascii="Times New Roman" w:cs="Times New Roman" w:eastAsia="Times New Roman" w:hAnsi="Times New Roman"/>
+          <w:sz w:val="26"/>
+          <w:szCs w:val="26"/>
+        </w:rPr>
+        <w:t xml:space="preserve">{#lich_cc}</w:t>
+      </w:r>
+    </w:p>
+    <w:p>
+      <w:pPr>
+        <w:spacing w:after="80" w:before="0" w:line="300"/>
+        <w:ind w:firstLine="567"/>
+        <w:jc w:val="both"/>
+      </w:pPr>
+      <w:r>
+        <w:rPr>
+          <w:rFonts w:ascii="Times New Roman" w:cs="Times New Roman" w:eastAsia="Times New Roman" w:hAnsi="Times New Roman"/>
+          <w:sz w:val="26"/>
+          <w:szCs w:val="26"/>
+        </w:rPr>
+        <w:t xml:space="preserve">- {ngay}: {du_an} ({loai}).</w:t>
+      </w:r>
+    </w:p>
+    <w:p>
+      <w:pPr>
+        <w:spacing w:after="80" w:before="0" w:line="300"/>
+        <w:ind w:firstLine="567"/>
+        <w:jc w:val="both"/>
+      </w:pPr>
+      <w:r>
+        <w:rPr>
+          <w:rFonts w:ascii="Times New Roman" w:cs="Times New Roman" w:eastAsia="Times New Roman" w:hAnsi="Times New Roman"/>
+          <w:sz w:val="26"/>
+          <w:szCs w:val="26"/>
+        </w:rPr>
+        <w:t xml:space="preserve">{/lich_cc}</w:t>
+      </w:r>
+    </w:p>
+    <w:p>
+      <w:pPr>
+        <w:spacing w:after="80" w:before="0" w:line="300"/>
+        <w:ind w:firstLine="567"/>
+        <w:jc w:val="both"/>
+      </w:pPr>
+      <w:r>
+        <w:rPr>
+          <w:rFonts w:ascii="Times New Roman" w:cs="Times New Roman" w:eastAsia="Times New Roman" w:hAnsi="Times New Roman"/>
+          <w:sz w:val="26"/>
+          <w:szCs w:val="26"/>
+        </w:rPr>
+        <w:t xml:space="preserve">{/co_lich_cc}</w:t>
       </w:r>
     </w:p>
     <w:p>

</xml_diff>